<commit_message>
Corregir errores tipográficos en la documentación del proyecto de gestión de tareas
</commit_message>
<xml_diff>
--- a/Sistema de Gestión de Tareas.docx
+++ b/Sistema de Gestión de Tareas.docx
@@ -19,7 +19,21 @@
     </w:p>
     <w:p>
       <w:r>
-        <w:t>Este proyecto es una excelente opción porque se basa en los conceptos de un CRUD que ya dominas, pero añade capas adicionales de complejidad como la gestión de usuarios y la seguridad, que son fundamentales en el desarrollo de aplicaciones web modernas.</w:t>
+        <w:t xml:space="preserve">Este proyecto es una excelente opción porque se basa en los conceptos de un CRUD que ya dominas, pero añade capas adicionales de complejidad como la </w:t>
+      </w:r>
+      <w:proofErr w:type="spellStart"/>
+      <w:r>
+        <w:t>gesti</w:t>
+      </w:r>
+      <w:r>
+        <w:t>x</w:t>
+      </w:r>
+      <w:r>
+        <w:t>ón</w:t>
+      </w:r>
+      <w:proofErr w:type="spellEnd"/>
+      <w:r>
+        <w:t xml:space="preserve"> de usuarios y la seguridad, que son fundamentales en el desarrollo de aplicaciones web modernas.</w:t>
       </w:r>
     </w:p>
     <w:p>
@@ -104,8 +118,16 @@
           <w:numId w:val="1"/>
         </w:numPr>
       </w:pPr>
-      <w:r>
-        <w:t>Inicio de sesión (login).</w:t>
+      <w:proofErr w:type="spellStart"/>
+      <w:r>
+        <w:t>Z|</w:t>
+      </w:r>
+      <w:r>
+        <w:t>Inicio</w:t>
+      </w:r>
+      <w:proofErr w:type="spellEnd"/>
+      <w:r>
+        <w:t xml:space="preserve"> de sesión (login).</w:t>
       </w:r>
     </w:p>
     <w:p>
@@ -342,7 +364,13 @@
         <w:t>Base de Datos:</w:t>
       </w:r>
       <w:r>
-        <w:t xml:space="preserve"> MySQL (o la que prefieras, como PostgreSQL) corriendo en un contenedor de Docker.</w:t>
+        <w:t xml:space="preserve"> </w:t>
+      </w:r>
+      <w:r>
+        <w:t>MARIADB</w:t>
+      </w:r>
+      <w:r>
+        <w:t xml:space="preserve"> (o la que prefieras, como PostgreSQL) corriendo en un contenedor de Docker.</w:t>
       </w:r>
     </w:p>
     <w:p>
@@ -1717,6 +1745,7 @@
   <w:style w:type="character" w:default="1" w:styleId="Fuentedeprrafopredeter">
     <w:name w:val="Default Paragraph Font"/>
     <w:uiPriority w:val="1"/>
+    <w:semiHidden/>
     <w:unhideWhenUsed/>
   </w:style>
   <w:style w:type="table" w:default="1" w:styleId="Tablanormal">

</xml_diff>